<commit_message>
docs: RNF-05 en el documento y menú lateral legible
Documento (Avances_Bomberos_corregido.docx y la copia del sitio):
- Nuevo RNF-05: el sistema no almacena datos biométricos.
- Tabla 5 gana la fila de Alta de credencial y Acceso en equipo compartido.
- Tabla 1 marca el mockup como aplicado; se corrige que es HTML y CSS.
- Párrafo nuevo con el hallazgo del caso de uso Registrar credencial, y
  punto 7 en Trabajo pendiente para llevarlo al diagrama.

Interfaz: cada opción del menú lateral es ahora un recuadro con borde
sobre un fondo más marcado, y los enlaces del nav del sitio suben a
tinta plena.

Co-Authored-By: Claude Opus 5 <noreply@anthropic.com>
Claude-Session: https://claude.ai/code/session_013NJqmTBomcGd5GtatcMH91
</commit_message>
<xml_diff>
--- a/docs/avance-proyecto-1.docx
+++ b/docs/avance-proyecto-1.docx
@@ -533,7 +533,7 @@
           <w:sz w:val="22"/>
           <w:szCs w:val="22"/>
         </w:rPr>
-        <w:t xml:space="preserve">entrevistas ni observación con bomberos reales, empathy maps, segmentación de usuarios, arquitectura de la información y prototipo navegable. El mockup de la aplicación se encuentra en elaboración y se agrega a este mismo documento antes de la entrega final.</w:t>
+        <w:t xml:space="preserve">entrevistas ni observación con bomberos reales, empathy maps, segmentación de usuarios, arquitectura de la información y prototipo navegable. El mockup de la aplicación ya está construido y publicado; las capturas de cada pantalla se integran a este mismo documento antes de la entrega final.</w:t>
       </w:r>
     </w:p>
     <w:p>
@@ -1846,7 +1846,7 @@
                 <w:sz w:val="20"/>
                 <w:szCs w:val="20"/>
               </w:rPr>
-              <w:t xml:space="preserve">Una pantalla por caso de uso, dibujada a mano en software de diseño.</w:t>
+              <w:t xml:space="preserve">Una pantalla por caso de uso, construida en HTML y CSS y publicada en la web.</w:t>
             </w:r>
           </w:p>
         </w:tc>
@@ -1879,7 +1879,7 @@
                 <w:sz w:val="20"/>
                 <w:szCs w:val="20"/>
               </w:rPr>
-              <w:t xml:space="preserve">En elaboración</w:t>
+              <w:t xml:space="preserve">Aplicado (figuras 8.1 a 8.6b)</w:t>
             </w:r>
           </w:p>
         </w:tc>
@@ -5430,6 +5430,111 @@
           </w:p>
         </w:tc>
       </w:tr>
+      <w:tr>
+        <w:trPr>
+          <w:cantSplit w:val="false"/>
+          <w:tblHeader w:val="false"/>
+        </w:trPr>
+        <w:tc>
+          <w:tcPr>
+            <w:tcW w:type="dxa" w:w="900"/>
+            <w:tcBorders>
+              <w:top w:val="single" w:color="888888" w:sz="4"/>
+              <w:left w:val="single" w:color="888888" w:sz="4"/>
+              <w:bottom w:val="single" w:color="888888" w:sz="4"/>
+              <w:right w:val="single" w:color="888888" w:sz="4"/>
+            </w:tcBorders>
+            <w:tcMar>
+              <w:top w:type="dxa" w:w="80"/>
+              <w:left w:type="dxa" w:w="100"/>
+              <w:bottom w:type="dxa" w:w="80"/>
+              <w:right w:type="dxa" w:w="100"/>
+            </w:tcMar>
+            <w:vAlign w:val="center"/>
+          </w:tcPr>
+          <w:p>
+            <w:pPr>
+              <w:jc w:val="both"/>
+            </w:pPr>
+            <w:r>
+              <w:rPr>
+                <w:rFonts w:ascii="Times New Roman" w:cs="Times New Roman" w:eastAsia="Times New Roman" w:hAnsi="Times New Roman"/>
+                <w:b w:val="false"/>
+                <w:bCs w:val="false"/>
+                <w:sz w:val="20"/>
+                <w:szCs w:val="20"/>
+              </w:rPr>
+              <w:t xml:space="preserve">RNF-05</w:t>
+            </w:r>
+          </w:p>
+        </w:tc>
+        <w:tc>
+          <w:tcPr>
+            <w:tcW w:type="dxa" w:w="3500"/>
+            <w:tcBorders>
+              <w:top w:val="single" w:color="888888" w:sz="4"/>
+              <w:left w:val="single" w:color="888888" w:sz="4"/>
+              <w:bottom w:val="single" w:color="888888" w:sz="4"/>
+              <w:right w:val="single" w:color="888888" w:sz="4"/>
+            </w:tcBorders>
+            <w:tcMar>
+              <w:top w:type="dxa" w:w="80"/>
+              <w:left w:type="dxa" w:w="100"/>
+              <w:bottom w:type="dxa" w:w="80"/>
+              <w:right w:type="dxa" w:w="100"/>
+            </w:tcMar>
+            <w:vAlign w:val="center"/>
+          </w:tcPr>
+          <w:p>
+            <w:pPr>
+              <w:jc w:val="both"/>
+            </w:pPr>
+            <w:r>
+              <w:rPr>
+                <w:rFonts w:ascii="Times New Roman" w:cs="Times New Roman" w:eastAsia="Times New Roman" w:hAnsi="Times New Roman"/>
+                <w:b w:val="false"/>
+                <w:bCs w:val="false"/>
+                <w:sz w:val="20"/>
+                <w:szCs w:val="20"/>
+              </w:rPr>
+              <w:t xml:space="preserve">El sistema no almacena datos biométricos: la verificación de identidad ocurre en el dispositivo del usuario y sólo se conserva la llave pública asociada a su matrícula.</w:t>
+            </w:r>
+          </w:p>
+        </w:tc>
+        <w:tc>
+          <w:tcPr>
+            <w:tcW w:type="dxa" w:w="4960"/>
+            <w:tcBorders>
+              <w:top w:val="single" w:color="888888" w:sz="4"/>
+              <w:left w:val="single" w:color="888888" w:sz="4"/>
+              <w:bottom w:val="single" w:color="888888" w:sz="4"/>
+              <w:right w:val="single" w:color="888888" w:sz="4"/>
+            </w:tcBorders>
+            <w:tcMar>
+              <w:top w:type="dxa" w:w="80"/>
+              <w:left w:type="dxa" w:w="100"/>
+              <w:bottom w:type="dxa" w:w="80"/>
+              <w:right w:type="dxa" w:w="100"/>
+            </w:tcMar>
+            <w:vAlign w:val="center"/>
+          </w:tcPr>
+          <w:p>
+            <w:pPr>
+              <w:jc w:val="both"/>
+            </w:pPr>
+            <w:r>
+              <w:rPr>
+                <w:rFonts w:ascii="Times New Roman" w:cs="Times New Roman" w:eastAsia="Times New Roman" w:hAnsi="Times New Roman"/>
+                <w:b w:val="false"/>
+                <w:bCs w:val="false"/>
+                <w:sz w:val="20"/>
+                <w:szCs w:val="20"/>
+              </w:rPr>
+              <w:t xml:space="preserve">El navegador nunca entrega la huella: el chip del dispositivo la compara y sólo responde si es o no la persona. Además, una huella filtrada no puede cambiarse y su tratamiento exige medidas reforzadas para un sujeto obligado. La llave pública basta para saber quién firmó y no identifica a nadie fuera del sistema.</w:t>
+            </w:r>
+          </w:p>
+        </w:tc>
+      </w:tr>
     </w:tbl>
     <w:p>
       <w:pPr>
@@ -5462,7 +5567,21 @@
           <w:sz w:val="22"/>
           <w:szCs w:val="22"/>
         </w:rPr>
-        <w:t xml:space="preserve">El equipo está elaborando de forma manual, en software de diseño, un mockup de baja fidelidad de la aplicación. Se agregará a este documento antes de la entrega final: cada pantalla tiene abajo su propio espacio reservado, para que la imagen quede junto a los casos de uso que representa y no en un bloque aparte al final.</w:t>
+        <w:t xml:space="preserve">El mockup de baja fidelidad ya está construido, en HTML y CSS, y puede recorrerse en https://ahhmed-j.github.io/Bomberos/. Se resolvió como aplicación web, no como aplicación de teléfono: el bombero la abre en el navegador del equipo, y el jefe de turno y la Dirección en el suyo. Cada pantalla conserva abajo su espacio reservado, para que la captura quede junto a los casos de uso que representa y no en un bloque aparte al final.</w:t>
+      </w:r>
+    </w:p>
+    <w:p>
+      <w:pPr>
+        <w:spacing w:after="200" w:line="276"/>
+        <w:jc w:val="both"/>
+      </w:pPr>
+      <w:r>
+        <w:rPr>
+          <w:rFonts w:ascii="Times New Roman" w:cs="Times New Roman" w:eastAsia="Times New Roman" w:hAnsi="Times New Roman"/>
+          <w:sz w:val="22"/>
+          <w:szCs w:val="22"/>
+        </w:rPr>
+        <w:t xml:space="preserve">Dibujar las pantallas dejó al descubierto un hueco del modelo. El caso de uso Iniciar sesión daba por hecho que la credencial del dispositivo ya existe, y no puede: antes de la primera sesión alguien tiene que dar fe de quién es cada bombero. De ahí sale un caso de uso que las figuras 1 a 4 todavía no contienen, Registrar credencial, a cargo del personal de la Dirección, que emite un código de alta de un solo uso. El segundo hallazgo es que en la computadora que comparte todo el turno el PIN del equipo no distingue a nadie, de modo que la credencial tiene que vivir en el teléfono o en la llave física de cada bombero. Ambas situaciones quedan dibujadas en las figuras 8.1a y 8.1b.</w:t>
       </w:r>
     </w:p>
     <w:p>
@@ -5734,6 +5853,111 @@
                 <w:sz w:val="20"/>
                 <w:szCs w:val="20"/>
               </w:rPr>
+              <w:t xml:space="preserve">Registrar credencial (caso de uso nuevo) / Iniciar sesión en equipo compartido</w:t>
+            </w:r>
+          </w:p>
+        </w:tc>
+        <w:tc>
+          <w:tcPr>
+            <w:tcW w:type="dxa" w:w="1900"/>
+            <w:tcBorders>
+              <w:top w:val="single" w:color="888888" w:sz="4"/>
+              <w:left w:val="single" w:color="888888" w:sz="4"/>
+              <w:bottom w:val="single" w:color="888888" w:sz="4"/>
+              <w:right w:val="single" w:color="888888" w:sz="4"/>
+            </w:tcBorders>
+            <w:tcMar>
+              <w:top w:type="dxa" w:w="80"/>
+              <w:left w:type="dxa" w:w="100"/>
+              <w:bottom w:type="dxa" w:w="80"/>
+              <w:right w:type="dxa" w:w="100"/>
+            </w:tcMar>
+            <w:vAlign w:val="center"/>
+          </w:tcPr>
+          <w:p>
+            <w:pPr>
+              <w:jc w:val="both"/>
+            </w:pPr>
+            <w:r>
+              <w:rPr>
+                <w:rFonts w:ascii="Times New Roman" w:cs="Times New Roman" w:eastAsia="Times New Roman" w:hAnsi="Times New Roman"/>
+                <w:b w:val="false"/>
+                <w:bCs w:val="false"/>
+                <w:sz w:val="20"/>
+                <w:szCs w:val="20"/>
+              </w:rPr>
+              <w:t xml:space="preserve">Alta de credencial y Acceso en equipo compartido</w:t>
+            </w:r>
+          </w:p>
+        </w:tc>
+        <w:tc>
+          <w:tcPr>
+            <w:tcW w:type="dxa" w:w="4460"/>
+            <w:tcBorders>
+              <w:top w:val="single" w:color="888888" w:sz="4"/>
+              <w:left w:val="single" w:color="888888" w:sz="4"/>
+              <w:bottom w:val="single" w:color="888888" w:sz="4"/>
+              <w:right w:val="single" w:color="888888" w:sz="4"/>
+            </w:tcBorders>
+            <w:tcMar>
+              <w:top w:type="dxa" w:w="80"/>
+              <w:left w:type="dxa" w:w="100"/>
+              <w:bottom w:type="dxa" w:w="80"/>
+              <w:right w:type="dxa" w:w="100"/>
+            </w:tcMar>
+            <w:vAlign w:val="center"/>
+          </w:tcPr>
+          <w:p>
+            <w:pPr>
+              <w:jc w:val="both"/>
+            </w:pPr>
+            <w:r>
+              <w:rPr>
+                <w:rFonts w:ascii="Times New Roman" w:cs="Times New Roman" w:eastAsia="Times New Roman" w:hAnsi="Times New Roman"/>
+                <w:b w:val="false"/>
+                <w:bCs w:val="false"/>
+                <w:sz w:val="20"/>
+                <w:szCs w:val="20"/>
+              </w:rPr>
+              <w:t xml:space="preserve">Código de alta de un solo uso emitido por la Dirección, que es lo que liga la credencial a un bombero concreto, y selector de quién captura cuando el equipo lo comparte todo el turno.</w:t>
+            </w:r>
+          </w:p>
+        </w:tc>
+      </w:tr>
+      <w:tr>
+        <w:trPr>
+          <w:cantSplit w:val="false"/>
+          <w:tblHeader w:val="false"/>
+        </w:trPr>
+        <w:tc>
+          <w:tcPr>
+            <w:tcW w:type="dxa" w:w="3000"/>
+            <w:tcBorders>
+              <w:top w:val="single" w:color="888888" w:sz="4"/>
+              <w:left w:val="single" w:color="888888" w:sz="4"/>
+              <w:bottom w:val="single" w:color="888888" w:sz="4"/>
+              <w:right w:val="single" w:color="888888" w:sz="4"/>
+            </w:tcBorders>
+            <w:tcMar>
+              <w:top w:type="dxa" w:w="80"/>
+              <w:left w:type="dxa" w:w="100"/>
+              <w:bottom w:type="dxa" w:w="80"/>
+              <w:right w:type="dxa" w:w="100"/>
+            </w:tcMar>
+            <w:vAlign w:val="center"/>
+          </w:tcPr>
+          <w:p>
+            <w:pPr>
+              <w:jc w:val="both"/>
+            </w:pPr>
+            <w:r>
+              <w:rPr>
+                <w:rFonts w:ascii="Times New Roman" w:cs="Times New Roman" w:eastAsia="Times New Roman" w:hAnsi="Times New Roman"/>
+                <w:b w:val="false"/>
+                <w:bCs w:val="false"/>
+                <w:sz w:val="20"/>
+                <w:szCs w:val="20"/>
+              </w:rPr>
               <w:t xml:space="preserve">Crear un nuevo parte / Registrar la emergencia / Adjuntar evidencia</w:t>
             </w:r>
           </w:p>
@@ -7348,7 +7572,7 @@
           <w:sz w:val="22"/>
           <w:szCs w:val="22"/>
         </w:rPr>
-        <w:t xml:space="preserve">1. Integrar el mockup de las seis pantallas a este documento.</w:t>
+        <w:t xml:space="preserve">1. Sustituir los espacios reservados por las capturas de las pantallas ya publicadas.</w:t>
       </w:r>
     </w:p>
     <w:p>
@@ -7419,6 +7643,20 @@
           <w:szCs w:val="22"/>
         </w:rPr>
         <w:t xml:space="preserve">6. Implementar el prototipo navegable con al menos un flujo completo de inicio a fin.</w:t>
+      </w:r>
+    </w:p>
+    <w:p>
+      <w:pPr>
+        <w:spacing w:after="140" w:line="276"/>
+        <w:jc w:val="both"/>
+      </w:pPr>
+      <w:r>
+        <w:rPr>
+          <w:rFonts w:ascii="Times New Roman" w:cs="Times New Roman" w:eastAsia="Times New Roman" w:hAnsi="Times New Roman"/>
+          <w:sz w:val="22"/>
+          <w:szCs w:val="22"/>
+        </w:rPr>
+        <w:t xml:space="preserve">7. Incorporar al diagrama de casos de uso el caso Registrar credencial y su relación con el personal de la Dirección, junto con la ruta de recuperación cuando un bombero pierde el equipo donde tenía su credencial.</w:t>
       </w:r>
     </w:p>
     <w:p>

</xml_diff>

<commit_message>
docs: el problema en la cabecera y el documento al día con las doce láminas
Sitio:
- Debajo del título va el problema; fuera la fecha, que no decía nada.
- Los rótulos en arena pasan a crema; las pestañas y las etiquetas de las
  pantallas, a tinta más oscura. El menú lateral ya estaba en negro.
- La 8.2 aclara que está dibujada sin señal; Josselyn ya aparece entre
  quienes tienen credencial en el equipo compartido.

Documento, sincronizado con las pantallas:
- Deja de ser una app de teléfono: es web, desde el celular o la estación.
- Entran las seis láminas que faltaban (8.1a, 8.1b, 8.3b, 8.4b, 8.5b, 8.6b)
  con su descripción y su espacio reservado.
- La Tabla 5 describe el Acceso como es hoy, no como un botón de huella.

Co-Authored-By: Claude Opus 5 <noreply@anthropic.com>
Claude-Session: https://claude.ai/code/session_013NJqmTBomcGd5GtatcMH91
</commit_message>
<xml_diff>
--- a/docs/avance-proyecto-1.docx
+++ b/docs/avance-proyecto-1.docx
@@ -581,7 +581,7 @@
           <w:sz w:val="22"/>
           <w:szCs w:val="22"/>
         </w:rPr>
-        <w:t xml:space="preserve">Los bomberos de Ensenada documentan a mano un reporte por cada emergencia atendida. Como el personal permanece ocupado durante toda la jornada, los reportes se acumulan y, además, alguien debe trasladar físicamente la papelería hasta la dirección de bomberos para entregarla. El proyecto propone una aplicación que permita capturar el parte desde el propio teléfono y enviarlo de forma digital.</w:t>
+        <w:t xml:space="preserve">Los bomberos de Ensenada documentan a mano un reporte por cada emergencia atendida. Como el personal permanece ocupado durante toda la jornada, los reportes se acumulan y, además, alguien debe trasladar físicamente la papelería hasta la dirección de bomberos para entregarla. El proyecto propone una aplicación web que permita capturar el parte desde el navegador —en el celular del bombero o en la computadora de la estación— y enviarlo de forma digital.</w:t>
       </w:r>
     </w:p>
     <w:p>
@@ -5814,7 +5814,7 @@
                 <w:sz w:val="20"/>
                 <w:szCs w:val="20"/>
               </w:rPr>
-              <w:t xml:space="preserve">Botón único de autenticación con huella o PIN del dispositivo.</w:t>
+              <w:t xml:space="preserve">Botón único que usa la credencial ya registrada en el equipo. En la computadora que comparte todo el turno, en cambio, hay que elegir quién captura y verificar con el teléfono o con una llave física.</w:t>
             </w:r>
           </w:p>
         </w:tc>
@@ -6461,7 +6461,7 @@
           <w:sz w:val="22"/>
           <w:szCs w:val="22"/>
         </w:rPr>
-        <w:t xml:space="preserve">Seis pantallas cubren los diez requerimientos funcionales. Esa reducción es intencional: agrupar la evidencia dentro del formulario del parte, y las tres acciones del jefe de turno dentro de una sola bandeja, evita que el bombero tenga que navegar entre pantallas en medio de una emergencia, que es justo lo que el requerimiento RNF-02 busca impedir.</w:t>
+        <w:t xml:space="preserve">Seis pantallas cubren los diez requerimientos funcionales, y a cada una se le dibujaron además sus estados alternos, hasta sumar doce láminas. Esa reducción es intencional: agrupar la evidencia dentro del formulario del parte, y las tres acciones del jefe de turno dentro de una sola bandeja, evita que el bombero tenga que navegar entre pantallas en medio de una emergencia, que es justo lo que el requerimiento RNF-02 busca impedir.</w:t>
       </w:r>
     </w:p>
     <w:p>
@@ -6524,7 +6524,7 @@
           <w:sz w:val="24"/>
           <w:szCs w:val="24"/>
         </w:rPr>
-        <w:t xml:space="preserve">2. Formulario del parte</w:t>
+        <w:t xml:space="preserve">1a. Alta de credencial</w:t>
       </w:r>
     </w:p>
     <w:p>
@@ -6538,7 +6538,7 @@
           <w:sz w:val="22"/>
           <w:szCs w:val="22"/>
         </w:rPr>
-        <w:t xml:space="preserve">Los campos del parte en un solo desplazamiento: tipo de emergencia, fecha, hora, ubicación, unidades y personal en sitio, más la sección inferior de evidencia con el botón de cámara y las miniaturas de las fotos ya adjuntas. Cubre RF-02, RF-03 y RF-06.</w:t>
+        <w:t xml:space="preserve">Pantalla del registro previo a la primera sesión. La Dirección da de alta al bombero y le entrega un código de un solo uso que caduca en 24 horas; al escribirlo, la pantalla muestra a quién pertenece antes de crear la credencial. Es el único momento en que una persona, y no el sistema, garantiza de quién es esa credencial. Cubre RF-01.</w:t>
       </w:r>
     </w:p>
     <w:p>
@@ -6555,7 +6555,7 @@
           <w:sz w:val="20"/>
           <w:szCs w:val="20"/>
         </w:rPr>
-        <w:t xml:space="preserve">[Espacio reservado para el mockup — Figura 8.2, pendiente de integrar.]</w:t>
+        <w:t xml:space="preserve">[Espacio reservado para el mockup — Figura 8.1a, pendiente de integrar.]</w:t>
       </w:r>
     </w:p>
     <w:p>
@@ -6571,7 +6571,7 @@
           <w:sz w:val="24"/>
           <w:szCs w:val="24"/>
         </w:rPr>
-        <w:t xml:space="preserve">3. Croquis</w:t>
+        <w:t xml:space="preserve">1b. Acceso en equipo compartido</w:t>
       </w:r>
     </w:p>
     <w:p>
@@ -6585,7 +6585,7 @@
           <w:sz w:val="22"/>
           <w:szCs w:val="22"/>
         </w:rPr>
-        <w:t xml:space="preserve">Cuadro de texto para describir la escena, el croquis generado debajo y los controles para mover o borrar elementos. Debe mostrar también el estado en que el croquis no se pudo generar. Cubre RF-04 y RF-05.</w:t>
+        <w:t xml:space="preserve">Pantalla de la computadora que usa todo el turno. Como su PIN lo conoce todo el personal, no sirve para distinguir quién firma: se elige quién va a capturar y la verificación ocurre en el teléfono de esa persona, mediante un código que se escanea, o en su llave física. Cubre RF-01.</w:t>
       </w:r>
     </w:p>
     <w:p>
@@ -6602,7 +6602,7 @@
           <w:sz w:val="20"/>
           <w:szCs w:val="20"/>
         </w:rPr>
-        <w:t xml:space="preserve">[Espacio reservado para el mockup — Figura 8.3, pendiente de integrar.]</w:t>
+        <w:t xml:space="preserve">[Espacio reservado para el mockup — Figura 8.1b, pendiente de integrar.]</w:t>
       </w:r>
     </w:p>
     <w:p>
@@ -6618,7 +6618,7 @@
           <w:sz w:val="24"/>
           <w:szCs w:val="24"/>
         </w:rPr>
-        <w:t xml:space="preserve">4. Resumen y firma</w:t>
+        <w:t xml:space="preserve">2. Formulario del parte</w:t>
       </w:r>
     </w:p>
     <w:p>
@@ -6632,7 +6632,7 @@
           <w:sz w:val="22"/>
           <w:szCs w:val="22"/>
         </w:rPr>
-        <w:t xml:space="preserve">Resumen de lo capturado, botón de firma con la credencial del dispositivo y confirmación de envío. Cubre RF-07.</w:t>
+        <w:t xml:space="preserve">Los campos del parte en un solo desplazamiento: tipo de emergencia, fecha, hora, ubicación, unidades y personal en sitio, más la sección inferior de evidencia con el botón de cámara y las miniaturas de las fotos ya adjuntas. Cubre RF-02, RF-03 y RF-06.</w:t>
       </w:r>
     </w:p>
     <w:p>
@@ -6649,7 +6649,7 @@
           <w:sz w:val="20"/>
           <w:szCs w:val="20"/>
         </w:rPr>
-        <w:t xml:space="preserve">[Espacio reservado para el mockup — Figura 8.4, pendiente de integrar.]</w:t>
+        <w:t xml:space="preserve">[Espacio reservado para el mockup — Figura 8.2, pendiente de integrar.]</w:t>
       </w:r>
     </w:p>
     <w:p>
@@ -6665,7 +6665,7 @@
           <w:sz w:val="24"/>
           <w:szCs w:val="24"/>
         </w:rPr>
-        <w:t xml:space="preserve">5. Bandeja del jefe de turno</w:t>
+        <w:t xml:space="preserve">3. Croquis</w:t>
       </w:r>
     </w:p>
     <w:p>
@@ -6679,7 +6679,7 @@
           <w:sz w:val="22"/>
           <w:szCs w:val="22"/>
         </w:rPr>
-        <w:t xml:space="preserve">Lista de partes pendientes y, al abrir uno, los dos botones de decisión: validar o devolver con nota de corrección. Cubre RF-08 y RF-09.</w:t>
+        <w:t xml:space="preserve">Cuadro de texto para describir la escena, el croquis generado debajo y los controles para mover o borrar elementos. Debe mostrar también el estado en que el croquis no se pudo generar. Cubre RF-04 y RF-05.</w:t>
       </w:r>
     </w:p>
     <w:p>
@@ -6696,7 +6696,7 @@
           <w:sz w:val="20"/>
           <w:szCs w:val="20"/>
         </w:rPr>
-        <w:t xml:space="preserve">[Espacio reservado para el mockup — Figura 8.5, pendiente de integrar.]</w:t>
+        <w:t xml:space="preserve">[Espacio reservado para el mockup — Figura 8.3, pendiente de integrar.]</w:t>
       </w:r>
     </w:p>
     <w:p>
@@ -6712,7 +6712,7 @@
           <w:sz w:val="24"/>
           <w:szCs w:val="24"/>
         </w:rPr>
-        <w:t xml:space="preserve">6. Panel de la Dirección</w:t>
+        <w:t xml:space="preserve">3b. Escenario donde el croquis no se pudo generar</w:t>
       </w:r>
     </w:p>
     <w:p>
@@ -6726,7 +6726,7 @@
           <w:sz w:val="22"/>
           <w:szCs w:val="22"/>
         </w:rPr>
-        <w:t xml:space="preserve">Barra de filtros por fecha, tipo y unidad, listado de resultados y botón de exportar. Al abrir un resultado se muestra su detalle completo. El jefe de turno también entra aquí para consultar el histórico de partes ya validados por su turno. Cubre RF-10.</w:t>
+        <w:t xml:space="preserve">El mismo paso del croquis cuando la interfaz de programación no responde. El parte se guarda igual y se ofrecen tres salidas: reintentar, dibujarlo a mano o agregarlo después desde la estación. Es la bifurcación de la Figura 6. Cubre RF-04 y el RNF-01.</w:t>
       </w:r>
     </w:p>
     <w:p>
@@ -6743,7 +6743,289 @@
           <w:sz w:val="20"/>
           <w:szCs w:val="20"/>
         </w:rPr>
+        <w:t xml:space="preserve">[Espacio reservado para el mockup — Figura 8.3b, pendiente de integrar.]</w:t>
+      </w:r>
+    </w:p>
+    <w:p>
+      <w:pPr>
+        <w:spacing w:after="140" w:before="260"/>
+      </w:pPr>
+      <w:r>
+        <w:rPr>
+          <w:rFonts w:ascii="Times New Roman" w:cs="Times New Roman" w:eastAsia="Times New Roman" w:hAnsi="Times New Roman"/>
+          <w:b/>
+          <w:bCs/>
+          <w:color w:val="1F1F1F"/>
+          <w:sz w:val="24"/>
+          <w:szCs w:val="24"/>
+        </w:rPr>
+        <w:t xml:space="preserve">4. Resumen y firma</w:t>
+      </w:r>
+    </w:p>
+    <w:p>
+      <w:pPr>
+        <w:spacing w:after="200" w:line="276"/>
+        <w:jc w:val="both"/>
+      </w:pPr>
+      <w:r>
+        <w:rPr>
+          <w:rFonts w:ascii="Times New Roman" w:cs="Times New Roman" w:eastAsia="Times New Roman" w:hAnsi="Times New Roman"/>
+          <w:sz w:val="22"/>
+          <w:szCs w:val="22"/>
+        </w:rPr>
+        <w:t xml:space="preserve">Resumen de lo capturado, botón de firma con la credencial del dispositivo y confirmación de envío. Cubre RF-07.</w:t>
+      </w:r>
+    </w:p>
+    <w:p>
+      <w:pPr>
+        <w:spacing w:after="280" w:before="80"/>
+        <w:jc w:val="center"/>
+      </w:pPr>
+      <w:r>
+        <w:rPr>
+          <w:rFonts w:ascii="Times New Roman" w:cs="Times New Roman" w:eastAsia="Times New Roman" w:hAnsi="Times New Roman"/>
+          <w:i/>
+          <w:iCs/>
+          <w:color w:val="777777"/>
+          <w:sz w:val="20"/>
+          <w:szCs w:val="20"/>
+        </w:rPr>
+        <w:t xml:space="preserve">[Espacio reservado para el mockup — Figura 8.4, pendiente de integrar.]</w:t>
+      </w:r>
+    </w:p>
+    <w:p>
+      <w:pPr>
+        <w:spacing w:after="140" w:before="260"/>
+      </w:pPr>
+      <w:r>
+        <w:rPr>
+          <w:rFonts w:ascii="Times New Roman" w:cs="Times New Roman" w:eastAsia="Times New Roman" w:hAnsi="Times New Roman"/>
+          <w:b/>
+          <w:bCs/>
+          <w:color w:val="1F1F1F"/>
+          <w:sz w:val="24"/>
+          <w:szCs w:val="24"/>
+        </w:rPr>
+        <w:t xml:space="preserve">4b. Confirmación de envío</w:t>
+      </w:r>
+    </w:p>
+    <w:p>
+      <w:pPr>
+        <w:spacing w:after="200" w:line="276"/>
+        <w:jc w:val="both"/>
+      </w:pPr>
+      <w:r>
+        <w:rPr>
+          <w:rFonts w:ascii="Times New Roman" w:cs="Times New Roman" w:eastAsia="Times New Roman" w:hAnsi="Times New Roman"/>
+          <w:sz w:val="22"/>
+          <w:szCs w:val="22"/>
+        </w:rPr>
+        <w:t xml:space="preserve">Comprobante de que el parte quedó firmado y entregado: folio, hora de envío, quién lo firmó y a qué jefe de turno le llegó. Cubre RF-07.</w:t>
+      </w:r>
+    </w:p>
+    <w:p>
+      <w:pPr>
+        <w:spacing w:after="280" w:before="80"/>
+        <w:jc w:val="center"/>
+      </w:pPr>
+      <w:r>
+        <w:rPr>
+          <w:rFonts w:ascii="Times New Roman" w:cs="Times New Roman" w:eastAsia="Times New Roman" w:hAnsi="Times New Roman"/>
+          <w:i/>
+          <w:iCs/>
+          <w:color w:val="777777"/>
+          <w:sz w:val="20"/>
+          <w:szCs w:val="20"/>
+        </w:rPr>
+        <w:t xml:space="preserve">[Espacio reservado para el mockup — Figura 8.4b, pendiente de integrar.]</w:t>
+      </w:r>
+    </w:p>
+    <w:p>
+      <w:pPr>
+        <w:spacing w:after="140" w:before="260"/>
+      </w:pPr>
+      <w:r>
+        <w:rPr>
+          <w:rFonts w:ascii="Times New Roman" w:cs="Times New Roman" w:eastAsia="Times New Roman" w:hAnsi="Times New Roman"/>
+          <w:b/>
+          <w:bCs/>
+          <w:color w:val="1F1F1F"/>
+          <w:sz w:val="24"/>
+          <w:szCs w:val="24"/>
+        </w:rPr>
+        <w:t xml:space="preserve">5. Bandeja del jefe de turno</w:t>
+      </w:r>
+    </w:p>
+    <w:p>
+      <w:pPr>
+        <w:spacing w:after="200" w:line="276"/>
+        <w:jc w:val="both"/>
+      </w:pPr>
+      <w:r>
+        <w:rPr>
+          <w:rFonts w:ascii="Times New Roman" w:cs="Times New Roman" w:eastAsia="Times New Roman" w:hAnsi="Times New Roman"/>
+          <w:sz w:val="22"/>
+          <w:szCs w:val="22"/>
+        </w:rPr>
+        <w:t xml:space="preserve">Lista de partes pendientes y, al abrir uno, los dos botones de decisión: validar o devolver con nota de corrección. Cubre RF-08 y RF-09.</w:t>
+      </w:r>
+    </w:p>
+    <w:p>
+      <w:pPr>
+        <w:spacing w:after="280" w:before="80"/>
+        <w:jc w:val="center"/>
+      </w:pPr>
+      <w:r>
+        <w:rPr>
+          <w:rFonts w:ascii="Times New Roman" w:cs="Times New Roman" w:eastAsia="Times New Roman" w:hAnsi="Times New Roman"/>
+          <w:i/>
+          <w:iCs/>
+          <w:color w:val="777777"/>
+          <w:sz w:val="20"/>
+          <w:szCs w:val="20"/>
+        </w:rPr>
+        <w:t xml:space="preserve">[Espacio reservado para el mockup — Figura 8.5, pendiente de integrar.]</w:t>
+      </w:r>
+    </w:p>
+    <w:p>
+      <w:pPr>
+        <w:spacing w:after="140" w:before="260"/>
+      </w:pPr>
+      <w:r>
+        <w:rPr>
+          <w:rFonts w:ascii="Times New Roman" w:cs="Times New Roman" w:eastAsia="Times New Roman" w:hAnsi="Times New Roman"/>
+          <w:b/>
+          <w:bCs/>
+          <w:color w:val="1F1F1F"/>
+          <w:sz w:val="24"/>
+          <w:szCs w:val="24"/>
+        </w:rPr>
+        <w:t xml:space="preserve">5b. Validar o devolver</w:t>
+      </w:r>
+    </w:p>
+    <w:p>
+      <w:pPr>
+        <w:spacing w:after="200" w:line="276"/>
+        <w:jc w:val="both"/>
+      </w:pPr>
+      <w:r>
+        <w:rPr>
+          <w:rFonts w:ascii="Times New Roman" w:cs="Times New Roman" w:eastAsia="Times New Roman" w:hAnsi="Times New Roman"/>
+          <w:sz w:val="22"/>
+          <w:szCs w:val="22"/>
+        </w:rPr>
+        <w:t xml:space="preserve">Lo que ve el jefe de turno al abrir uno de los partes de su bandeja: los datos, el croquis, las fotos y los dos botones de decisión, con el recuadro donde escribe la nota cuando devuelve. Cubre RF-09.</w:t>
+      </w:r>
+    </w:p>
+    <w:p>
+      <w:pPr>
+        <w:spacing w:after="280" w:before="80"/>
+        <w:jc w:val="center"/>
+      </w:pPr>
+      <w:r>
+        <w:rPr>
+          <w:rFonts w:ascii="Times New Roman" w:cs="Times New Roman" w:eastAsia="Times New Roman" w:hAnsi="Times New Roman"/>
+          <w:i/>
+          <w:iCs/>
+          <w:color w:val="777777"/>
+          <w:sz w:val="20"/>
+          <w:szCs w:val="20"/>
+        </w:rPr>
+        <w:t xml:space="preserve">[Espacio reservado para el mockup — Figura 8.5b, pendiente de integrar.]</w:t>
+      </w:r>
+    </w:p>
+    <w:p>
+      <w:pPr>
+        <w:spacing w:after="140" w:before="260"/>
+      </w:pPr>
+      <w:r>
+        <w:rPr>
+          <w:rFonts w:ascii="Times New Roman" w:cs="Times New Roman" w:eastAsia="Times New Roman" w:hAnsi="Times New Roman"/>
+          <w:b/>
+          <w:bCs/>
+          <w:color w:val="1F1F1F"/>
+          <w:sz w:val="24"/>
+          <w:szCs w:val="24"/>
+        </w:rPr>
+        <w:t xml:space="preserve">6. Panel de la Dirección</w:t>
+      </w:r>
+    </w:p>
+    <w:p>
+      <w:pPr>
+        <w:spacing w:after="200" w:line="276"/>
+        <w:jc w:val="both"/>
+      </w:pPr>
+      <w:r>
+        <w:rPr>
+          <w:rFonts w:ascii="Times New Roman" w:cs="Times New Roman" w:eastAsia="Times New Roman" w:hAnsi="Times New Roman"/>
+          <w:sz w:val="22"/>
+          <w:szCs w:val="22"/>
+        </w:rPr>
+        <w:t xml:space="preserve">Barra de filtros por fecha, tipo y unidad, listado de resultados y botón de exportar. Al abrir un resultado se muestra su detalle completo. El jefe de turno también entra aquí para consultar el histórico de partes ya validados por su turno. Cubre RF-10.</w:t>
+      </w:r>
+    </w:p>
+    <w:p>
+      <w:pPr>
+        <w:spacing w:after="280" w:before="80"/>
+        <w:jc w:val="center"/>
+      </w:pPr>
+      <w:r>
+        <w:rPr>
+          <w:rFonts w:ascii="Times New Roman" w:cs="Times New Roman" w:eastAsia="Times New Roman" w:hAnsi="Times New Roman"/>
+          <w:i/>
+          <w:iCs/>
+          <w:color w:val="777777"/>
+          <w:sz w:val="20"/>
+          <w:szCs w:val="20"/>
+        </w:rPr>
         <w:t xml:space="preserve">[Espacio reservado para el mockup — Figura 8.6, pendiente de integrar.]</w:t>
+      </w:r>
+    </w:p>
+    <w:p>
+      <w:pPr>
+        <w:spacing w:after="140" w:before="260"/>
+      </w:pPr>
+      <w:r>
+        <w:rPr>
+          <w:rFonts w:ascii="Times New Roman" w:cs="Times New Roman" w:eastAsia="Times New Roman" w:hAnsi="Times New Roman"/>
+          <w:b/>
+          <w:bCs/>
+          <w:color w:val="1F1F1F"/>
+          <w:sz w:val="24"/>
+          <w:szCs w:val="24"/>
+        </w:rPr>
+        <w:t xml:space="preserve">6b. Detalle del parte</w:t>
+      </w:r>
+    </w:p>
+    <w:p>
+      <w:pPr>
+        <w:spacing w:after="200" w:line="276"/>
+        <w:jc w:val="both"/>
+      </w:pPr>
+      <w:r>
+        <w:rPr>
+          <w:rFonts w:ascii="Times New Roman" w:cs="Times New Roman" w:eastAsia="Times New Roman" w:hAnsi="Times New Roman"/>
+          <w:sz w:val="22"/>
+          <w:szCs w:val="22"/>
+        </w:rPr>
+        <w:t xml:space="preserve">Lo que aparece cuando alguien de la Dirección abre uno de los renglones del listado: el parte completo, con su croquis, su evidencia y la trazabilidad de quién lo capturó, quién lo firmó y quién lo validó. Cubre RF-10.</w:t>
+      </w:r>
+    </w:p>
+    <w:p>
+      <w:pPr>
+        <w:spacing w:after="280" w:before="80"/>
+        <w:jc w:val="center"/>
+      </w:pPr>
+      <w:r>
+        <w:rPr>
+          <w:rFonts w:ascii="Times New Roman" w:cs="Times New Roman" w:eastAsia="Times New Roman" w:hAnsi="Times New Roman"/>
+          <w:i/>
+          <w:iCs/>
+          <w:color w:val="777777"/>
+          <w:sz w:val="20"/>
+          <w:szCs w:val="20"/>
+        </w:rPr>
+        <w:t xml:space="preserve">[Espacio reservado para el mockup — Figura 8.6b, pendiente de integrar.]</w:t>
       </w:r>
     </w:p>
     <w:p>

</xml_diff>